<commit_message>
Add anchoring analyses: edits in measured AChE pairs, in-domain time split, calibration, anchored parents
</commit_message>
<xml_diff>
--- a/paper/Cover_Letter.docx
+++ b/paper/Cover_Letter.docx
@@ -27,12 +27,12 @@
     </w:p>
     <w:p>
       <w:r>
-        <w:t>Computational AChE papers usually stop at a predicted potency. Here a set of 2,700 designed analogues of potent published inhibitors is carried through activity, brain-penetration, drug-likeness, toxicity, docking, protonation, tautomer and stereochemistry gates, a four-source novelty search (PubChem exact and same-connectivity, ChEMBL flexmatch, SureChEMBL) and a computed retrosynthesis to purchasable starting materials. 106 molecules clear every gate; each has a computed route of one to six steps, and a synthesis dossier lists structure, route, predicted values with margins and the flags that decide what to measure first.</w:t>
+        <w:t>Computational AChE papers usually stop at a predicted potency. Here 383,752 one- and two-edit analogues of 2,225 potent published inhibitors are reduced at the design stage to 2,700 designs, which are carried through activity, brain-penetration, drug-likeness, toxicity, docking, protonation, tautomer and stereochemistry gates, a four-source novelty search (PubChem exact and same-connectivity, ChEMBL flexmatch, SureChEMBL) and a computed retrosynthesis to purchasable starting materials. 106 molecules clear every gate; each has a computed route of one to six steps, and a synthesis dossier lists structure, route, predicted values with margins and the flags that decide what to measure first.</w:t>
       </w:r>
     </w:p>
     <w:p>
       <w:r>
-        <w:t>What we think is of interest to readers of this journal: the models behind every gate are reported with held-out-scaffold performance and simple baselines, including the places where a component is weak (the docking score separates binders from matched decoys only weakly; the P-gp term did not separate BBB-permeable from non-permeable compounds; the activity model matches nearest-neighbor lookup on chemistry unlike its training data). An independent audit script re-reads every gate from the delivered file, and it found, and we corrected, a gate that had not been applied to part of the candidate pool. A novelty search found nine otherwise eligible candidates in a series whose parents are covered by earlier patent and literature disclosures, and we excluded them.</w:t>
+        <w:t>What we think is of interest to readers of this journal: the models behind every gate are reported with held-out-scaffold performance and simple baselines, including the places where a component is weak (the docking score separates binders from matched decoys only weakly; the P-gp term did not separate BBB-permeable from non-permeable compounds; the activity model matches nearest-neighbor lookup on chemistry unlike its training data, a result we report together with the in-domain result, where it ranks later-published compounds clearly better than the baselines). We also anchor the design to measured data: the substitutions used are tested in real AChE compound pairs, each molecule is tied to a measured potent parent, and a blind re-discovery test, which does not favour our edit library over random edits, is reported as it came out. An independent audit script re-reads every gate from the delivered file, and it found, and we corrected, a gate that had not been applied to part of the candidate pool. A novelty search found nine otherwise eligible candidates in a series whose parents are covered by earlier patent and literature disclosures, and we excluded them.</w:t>
       </w:r>
     </w:p>
     <w:p>

</xml_diff>